<commit_message>
added two test cases (simple and complex) expanded the preliminary results doc
</commit_message>
<xml_diff>
--- a/PreliminaryResults.docx
+++ b/PreliminaryResults.docx
@@ -12,7 +12,19 @@
     </w:p>
     <w:p>
       <w:r>
-        <w:t xml:space="preserve">The goal of the project is to explore the Graph Neural Network architectures’ capabilities in detecting patterns and outliers in systems engineering models. Systems Engineering (in particular Model Based Systems Engineering) is a fairly young discipline focusing on managing complexity in engineering projects. A typical systems engineering model, breaks down a product architecture into System Requirements, System Functions and Logical and Physical Components. Each one of those “domains” is decomposed through tiers representing decreasing levels of abstraction. The critical aspect of Systems Engineering is traceability consisting in the allocation of requirements at different levels of the architecture and ensuring that those requirements are met. A requirement that is missed can in some cases lead to catastrophic accidents leading to the loss of human life. For that reason, robust identification of </w:t>
+        <w:t xml:space="preserve">The goal of the project is to explore the Graph Neural Network architectures’ capabilities in detecting patterns and outliers in systems engineering models. Systems Engineering (in particular Model Based Systems Engineering) is a fairly young discipline focusing on managing complexity in engineering projects. A typical systems engineering model, breaks down a product architecture into System Requirements, System Functions and Logical and Physical Components. Each one of those “domains” is decomposed through tiers representing decreasing levels of abstraction. The critical aspect of Systems Engineering is traceability consisting in the allocation of requirements at different levels of the architecture and ensuring that those requirements are </w:t>
+      </w:r>
+      <w:r>
+        <w:t>satisfied</w:t>
+      </w:r>
+      <w:r>
+        <w:t xml:space="preserve">. A requirement that is missed </w:t>
+      </w:r>
+      <w:r>
+        <w:t xml:space="preserve">(either left unallocated or unsatisfied) </w:t>
+      </w:r>
+      <w:r>
+        <w:t xml:space="preserve">can in some cases lead to catastrophic accidents leading to the loss of human life. For that reason, robust identification of </w:t>
       </w:r>
       <w:r>
         <w:t>gaps in traceability can indeed be a matter of life and death.</w:t>
@@ -48,12 +60,112 @@
           </w:r>
         </w:sdtContent>
       </w:sdt>
+      <w:r>
+        <w:t xml:space="preserve"> The square windows placed in the fuselage caused cracks in their corners due to fatigue following multiple pressurization and depressurization cycles.</w:t>
+      </w:r>
     </w:p>
+    <w:p>
+      <w:r>
+        <w:rPr>
+          <w:noProof/>
+        </w:rPr>
+        <w:drawing>
+          <wp:inline distT="0" distB="0" distL="0" distR="0" wp14:anchorId="28F58E7D" wp14:editId="711B9B48">
+            <wp:extent cx="5943600" cy="2997835"/>
+            <wp:effectExtent l="0" t="0" r="0" b="0"/>
+            <wp:docPr id="1428753225" name="Picture 1" descr="Aircrash Minority Report - The Untold Truth about the de Havilland Comet Disaster"/>
+            <wp:cNvGraphicFramePr>
+              <a:graphicFrameLocks xmlns:a="http://schemas.openxmlformats.org/drawingml/2006/main" noChangeAspect="1"/>
+            </wp:cNvGraphicFramePr>
+            <a:graphic xmlns:a="http://schemas.openxmlformats.org/drawingml/2006/main">
+              <a:graphicData uri="http://schemas.openxmlformats.org/drawingml/2006/picture">
+                <pic:pic xmlns:pic="http://schemas.openxmlformats.org/drawingml/2006/picture">
+                  <pic:nvPicPr>
+                    <pic:cNvPr id="0" name="Picture 1" descr="Aircrash Minority Report - The Untold Truth about the de Havilland Comet Disaster"/>
+                    <pic:cNvPicPr>
+                      <a:picLocks noChangeAspect="1" noChangeArrowheads="1"/>
+                    </pic:cNvPicPr>
+                  </pic:nvPicPr>
+                  <pic:blipFill>
+                    <a:blip r:embed="rId6">
+                      <a:extLst>
+                        <a:ext uri="{28A0092B-C50C-407E-A947-70E740481C1C}">
+                          <a14:useLocalDpi xmlns:a14="http://schemas.microsoft.com/office/drawing/2010/main" val="0"/>
+                        </a:ext>
+                      </a:extLst>
+                    </a:blip>
+                    <a:srcRect/>
+                    <a:stretch>
+                      <a:fillRect/>
+                    </a:stretch>
+                  </pic:blipFill>
+                  <pic:spPr bwMode="auto">
+                    <a:xfrm>
+                      <a:off x="0" y="0"/>
+                      <a:ext cx="5943600" cy="2997835"/>
+                    </a:xfrm>
+                    <a:prstGeom prst="rect">
+                      <a:avLst/>
+                    </a:prstGeom>
+                    <a:noFill/>
+                    <a:ln>
+                      <a:noFill/>
+                    </a:ln>
+                  </pic:spPr>
+                </pic:pic>
+              </a:graphicData>
+            </a:graphic>
+          </wp:inline>
+        </w:drawing>
+      </w:r>
+    </w:p>
+    <w:p>
+      <w:pPr>
+        <w:pStyle w:val="Caption"/>
+      </w:pPr>
+      <w:r>
+        <w:rPr>
+          <w:b/>
+          <w:bCs/>
+        </w:rPr>
+        <w:t>De Havil</w:t>
+      </w:r>
+      <w:r>
+        <w:rPr>
+          <w:b/>
+          <w:bCs/>
+        </w:rPr>
+        <w:t>l</w:t>
+      </w:r>
+      <w:r>
+        <w:rPr>
+          <w:b/>
+          <w:bCs/>
+        </w:rPr>
+        <w:t>and Comet</w:t>
+      </w:r>
+      <w:r>
+        <w:rPr>
+          <w:b/>
+          <w:bCs/>
+        </w:rPr>
+        <w:t>’s square</w:t>
+      </w:r>
+      <w:r>
+        <w:rPr>
+          <w:b/>
+          <w:bCs/>
+        </w:rPr>
+        <w:t xml:space="preserve"> windows</w:t>
+      </w:r>
+    </w:p>
+    <w:p/>
     <w:p>
       <w:pPr>
         <w:pStyle w:val="Heading1"/>
       </w:pPr>
       <w:r>
+        <w:lastRenderedPageBreak/>
         <w:t>Technical background</w:t>
       </w:r>
     </w:p>
@@ -73,9 +185,27 @@
       <w:r>
         <w:t>Direct satisfaction of allocated requirement – an outlier in this case is any allocate or satisfy relationship that does not coexist with a complementary relationship going the opposite way.</w:t>
       </w:r>
+      <w:r>
+        <w:t xml:space="preserve"> </w:t>
+      </w:r>
+      <w:r>
+        <w:t>Any requirement that is allocated to an element, must be satisfied by that same element. If not, that allocate link is considered an outlier. Also</w:t>
+      </w:r>
+      <w:r>
+        <w:t>,</w:t>
+      </w:r>
+      <w:r>
+        <w:t xml:space="preserve"> a satisfy link can only point to a requirement that is allocated to it. If not, that satisfy link is considered an outlier.</w:t>
+      </w:r>
     </w:p>
     <w:p>
-      <w:r>
+      <w:pPr>
+        <w:pStyle w:val="Caption"/>
+      </w:pPr>
+      <w:r>
+        <w:rPr>
+          <w:noProof/>
+        </w:rPr>
         <w:drawing>
           <wp:inline distT="0" distB="0" distL="0" distR="0" wp14:anchorId="01C2610F" wp14:editId="3FB3751C">
             <wp:extent cx="5943600" cy="799465"/>
@@ -92,7 +222,7 @@
                     <pic:cNvPicPr/>
                   </pic:nvPicPr>
                   <pic:blipFill>
-                    <a:blip r:embed="rId6"/>
+                    <a:blip r:embed="rId7"/>
                     <a:stretch>
                       <a:fillRect/>
                     </a:stretch>
@@ -112,6 +242,84 @@
           </wp:inline>
         </w:drawing>
       </w:r>
+      <w:r>
+        <w:rPr>
+          <w:b/>
+          <w:bCs/>
+          <w:szCs w:val="20"/>
+        </w:rPr>
+        <w:t xml:space="preserve"> </w:t>
+      </w:r>
+      <w:r>
+        <w:rPr>
+          <w:b/>
+          <w:bCs/>
+          <w:szCs w:val="20"/>
+        </w:rPr>
+        <w:t xml:space="preserve">Figure </w:t>
+      </w:r>
+      <w:r>
+        <w:rPr>
+          <w:b/>
+          <w:bCs/>
+          <w:szCs w:val="20"/>
+        </w:rPr>
+        <w:fldChar w:fldCharType="begin"/>
+      </w:r>
+      <w:r>
+        <w:rPr>
+          <w:b/>
+          <w:bCs/>
+          <w:szCs w:val="20"/>
+        </w:rPr>
+        <w:instrText xml:space="preserve"> SEQ Figure \* ARABIC </w:instrText>
+      </w:r>
+      <w:r>
+        <w:rPr>
+          <w:b/>
+          <w:bCs/>
+          <w:szCs w:val="20"/>
+        </w:rPr>
+        <w:fldChar w:fldCharType="separate"/>
+      </w:r>
+      <w:r>
+        <w:rPr>
+          <w:b/>
+          <w:bCs/>
+          <w:noProof/>
+          <w:szCs w:val="20"/>
+        </w:rPr>
+        <w:t>1</w:t>
+      </w:r>
+      <w:r>
+        <w:rPr>
+          <w:b/>
+          <w:bCs/>
+          <w:szCs w:val="20"/>
+        </w:rPr>
+        <w:fldChar w:fldCharType="end"/>
+      </w:r>
+      <w:r>
+        <w:rPr>
+          <w:b/>
+          <w:bCs/>
+          <w:szCs w:val="20"/>
+        </w:rPr>
+        <w:t xml:space="preserve"> - </w:t>
+      </w:r>
+      <w:r>
+        <w:rPr>
+          <w:b/>
+          <w:bCs/>
+        </w:rPr>
+        <w:t>Simple outliers</w:t>
+      </w:r>
+      <w:r>
+        <w:t xml:space="preserve">. </w:t>
+      </w:r>
+      <w:r>
+        <w:t>Direct satisfaction of allocated requirement</w:t>
+      </w:r>
     </w:p>
     <w:p>
       <w:pPr>
@@ -124,10 +332,27 @@
       <w:r>
         <w:t>Decomposition of the allocation target – an outlier in this case is any allocate that does not coexist with a set of decompose and satisfy link whose chain completes the loop or a satisfy link that does not participate in such a loop.</w:t>
       </w:r>
+      <w:r>
+        <w:t xml:space="preserve"> </w:t>
+      </w:r>
+      <w:r>
+        <w:t>Any requirement that is allocated to an element (function or component), must be satisfied by that element or one of its children in the hierarchy. If not, that allocate link is considered an outlier. Also</w:t>
+      </w:r>
+      <w:r>
+        <w:t>,</w:t>
+      </w:r>
+      <w:r>
+        <w:t xml:space="preserve"> a satisfy link can only point to a requirement that is allocated to it or one of its parents. If not, that satisfy link is considered an outlier.</w:t>
+      </w:r>
     </w:p>
     <w:p>
-      <w:r>
-        <w:lastRenderedPageBreak/>
+      <w:pPr>
+        <w:keepNext/>
+      </w:pPr>
+      <w:r>
+        <w:rPr>
+          <w:noProof/>
+        </w:rPr>
         <w:drawing>
           <wp:inline distT="0" distB="0" distL="0" distR="0" wp14:anchorId="44DA2CDC" wp14:editId="17F71649">
             <wp:extent cx="5943600" cy="1213485"/>
@@ -144,7 +369,7 @@
                     <pic:cNvPicPr/>
                   </pic:nvPicPr>
                   <pic:blipFill>
-                    <a:blip r:embed="rId7"/>
+                    <a:blip r:embed="rId8"/>
                     <a:stretch>
                       <a:fillRect/>
                     </a:stretch>
@@ -167,6 +392,85 @@
     </w:p>
     <w:p>
       <w:pPr>
+        <w:pStyle w:val="Caption"/>
+      </w:pPr>
+      <w:r>
+        <w:rPr>
+          <w:b/>
+          <w:bCs/>
+          <w:szCs w:val="20"/>
+        </w:rPr>
+        <w:t xml:space="preserve">Figure </w:t>
+      </w:r>
+      <w:r>
+        <w:rPr>
+          <w:b/>
+          <w:bCs/>
+          <w:szCs w:val="20"/>
+        </w:rPr>
+        <w:fldChar w:fldCharType="begin"/>
+      </w:r>
+      <w:r>
+        <w:rPr>
+          <w:b/>
+          <w:bCs/>
+          <w:szCs w:val="20"/>
+        </w:rPr>
+        <w:instrText xml:space="preserve"> SEQ Figure \* ARABIC </w:instrText>
+      </w:r>
+      <w:r>
+        <w:rPr>
+          <w:b/>
+          <w:bCs/>
+          <w:szCs w:val="20"/>
+        </w:rPr>
+        <w:fldChar w:fldCharType="separate"/>
+      </w:r>
+      <w:r>
+        <w:rPr>
+          <w:b/>
+          <w:bCs/>
+          <w:noProof/>
+          <w:szCs w:val="20"/>
+        </w:rPr>
+        <w:t>2</w:t>
+      </w:r>
+      <w:r>
+        <w:rPr>
+          <w:b/>
+          <w:bCs/>
+          <w:szCs w:val="20"/>
+        </w:rPr>
+        <w:fldChar w:fldCharType="end"/>
+      </w:r>
+      <w:r>
+        <w:rPr>
+          <w:b/>
+          <w:bCs/>
+          <w:szCs w:val="20"/>
+        </w:rPr>
+        <w:t xml:space="preserve"> - </w:t>
+      </w:r>
+      <w:r>
+        <w:rPr>
+          <w:b/>
+          <w:bCs/>
+        </w:rPr>
+        <w:t>Standard outliers</w:t>
+      </w:r>
+      <w:r>
+        <w:rPr>
+          <w:b/>
+          <w:bCs/>
+        </w:rPr>
+        <w:t>.</w:t>
+      </w:r>
+      <w:r>
+        <w:t xml:space="preserve"> Decomposition of the allocation target</w:t>
+      </w:r>
+    </w:p>
+    <w:p>
+      <w:pPr>
         <w:pStyle w:val="ListParagraph"/>
         <w:numPr>
           <w:ilvl w:val="0"/>
@@ -176,9 +480,31 @@
       <w:r>
         <w:t>Satisfying the sum of decomposed requirements – an outlier in this case is any allocate relationship where the set of decomposed requirements is not fully satisfied or a satisfy relationship that is redundant.</w:t>
       </w:r>
+      <w:r>
+        <w:t xml:space="preserve"> Any</w:t>
+      </w:r>
+      <w:r>
+        <w:t xml:space="preserve"> requirement </w:t>
+      </w:r>
+      <w:r>
+        <w:t xml:space="preserve">that </w:t>
+      </w:r>
+      <w:r>
+        <w:t xml:space="preserve">is allocated to an element (function or component), then that requirement must be decomposed and each of its children must be satisfied either directly or recursively through that same decomposition rule. A requirement whose children are not all satisfied is an outlier. Also, if a satisfy link points to a requirement </w:t>
+      </w:r>
+      <w:r>
+        <w:lastRenderedPageBreak/>
+        <w:t>that is not allocated to it or one of its parents or if that requirement is already satisfied through its children, that satisfy link is an outlier</w:t>
+      </w:r>
     </w:p>
     <w:p>
-      <w:r>
+      <w:pPr>
+        <w:keepNext/>
+      </w:pPr>
+      <w:r>
+        <w:rPr>
+          <w:noProof/>
+        </w:rPr>
         <w:drawing>
           <wp:inline distT="0" distB="0" distL="0" distR="0" wp14:anchorId="5935E44A" wp14:editId="5A06D85F">
             <wp:extent cx="5943600" cy="1205865"/>
@@ -195,7 +521,7 @@
                     <pic:cNvPicPr/>
                   </pic:nvPicPr>
                   <pic:blipFill>
-                    <a:blip r:embed="rId8"/>
+                    <a:blip r:embed="rId9"/>
                     <a:stretch>
                       <a:fillRect/>
                     </a:stretch>
@@ -217,10 +543,420 @@
       </w:r>
     </w:p>
     <w:p>
-      <w:r>
+      <w:pPr>
+        <w:pStyle w:val="Caption"/>
+      </w:pPr>
+      <w:r>
+        <w:rPr>
+          <w:b/>
+          <w:bCs/>
+          <w:szCs w:val="20"/>
+        </w:rPr>
+        <w:t xml:space="preserve">Figure </w:t>
+      </w:r>
+      <w:r>
+        <w:rPr>
+          <w:b/>
+          <w:bCs/>
+          <w:szCs w:val="20"/>
+        </w:rPr>
+        <w:fldChar w:fldCharType="begin"/>
+      </w:r>
+      <w:r>
+        <w:rPr>
+          <w:b/>
+          <w:bCs/>
+          <w:szCs w:val="20"/>
+        </w:rPr>
+        <w:instrText xml:space="preserve"> SEQ Figure \* ARABIC </w:instrText>
+      </w:r>
+      <w:r>
+        <w:rPr>
+          <w:b/>
+          <w:bCs/>
+          <w:szCs w:val="20"/>
+        </w:rPr>
+        <w:fldChar w:fldCharType="separate"/>
+      </w:r>
+      <w:r>
+        <w:rPr>
+          <w:b/>
+          <w:bCs/>
+          <w:noProof/>
+          <w:szCs w:val="20"/>
+        </w:rPr>
+        <w:t>3</w:t>
+      </w:r>
+      <w:r>
+        <w:rPr>
+          <w:b/>
+          <w:bCs/>
+          <w:szCs w:val="20"/>
+        </w:rPr>
+        <w:fldChar w:fldCharType="end"/>
+      </w:r>
+      <w:r>
+        <w:rPr>
+          <w:b/>
+          <w:bCs/>
+          <w:szCs w:val="20"/>
+        </w:rPr>
+        <w:t xml:space="preserve"> - </w:t>
+      </w:r>
+      <w:r>
+        <w:rPr>
+          <w:b/>
+          <w:bCs/>
+        </w:rPr>
+        <w:t>Complex</w:t>
+      </w:r>
+      <w:r>
+        <w:rPr>
+          <w:b/>
+          <w:bCs/>
+        </w:rPr>
+        <w:t xml:space="preserve"> outliers</w:t>
+      </w:r>
+      <w:r>
+        <w:rPr>
+          <w:b/>
+          <w:bCs/>
+        </w:rPr>
+        <w:t>.</w:t>
+      </w:r>
+      <w:r>
+        <w:t xml:space="preserve"> Satisfying the sum of decomposed requirements</w:t>
+      </w:r>
+    </w:p>
+    <w:p>
+      <w:r>
+        <w:t>The synthetic models we generated are sets of graphs where each domain is composed of 50 elements in a hierarchy of 3 tiers for requirements and 4 tiers for functions and components.</w:t>
+      </w:r>
+      <w:r>
+        <w:t xml:space="preserve"> The plot below shows a simple example with only 6 elements in each domain.</w:t>
+      </w:r>
+    </w:p>
+    <w:p>
+      <w:r>
+        <w:rPr>
+          <w:noProof/>
+        </w:rPr>
+        <w:drawing>
+          <wp:inline distT="0" distB="0" distL="0" distR="0" wp14:anchorId="14BCFB49" wp14:editId="4567A58C">
+            <wp:extent cx="5943600" cy="4010660"/>
+            <wp:effectExtent l="0" t="0" r="0" b="8890"/>
+            <wp:docPr id="400398445" name="Picture 4"/>
+            <wp:cNvGraphicFramePr>
+              <a:graphicFrameLocks xmlns:a="http://schemas.openxmlformats.org/drawingml/2006/main" noChangeAspect="1"/>
+            </wp:cNvGraphicFramePr>
+            <a:graphic xmlns:a="http://schemas.openxmlformats.org/drawingml/2006/main">
+              <a:graphicData uri="http://schemas.openxmlformats.org/drawingml/2006/picture">
+                <pic:pic xmlns:pic="http://schemas.openxmlformats.org/drawingml/2006/picture">
+                  <pic:nvPicPr>
+                    <pic:cNvPr id="0" name="Picture 6"/>
+                    <pic:cNvPicPr>
+                      <a:picLocks noChangeAspect="1" noChangeArrowheads="1"/>
+                    </pic:cNvPicPr>
+                  </pic:nvPicPr>
+                  <pic:blipFill>
+                    <a:blip r:embed="rId10">
+                      <a:extLst>
+                        <a:ext uri="{28A0092B-C50C-407E-A947-70E740481C1C}">
+                          <a14:useLocalDpi xmlns:a14="http://schemas.microsoft.com/office/drawing/2010/main" val="0"/>
+                        </a:ext>
+                      </a:extLst>
+                    </a:blip>
+                    <a:srcRect/>
+                    <a:stretch>
+                      <a:fillRect/>
+                    </a:stretch>
+                  </pic:blipFill>
+                  <pic:spPr bwMode="auto">
+                    <a:xfrm>
+                      <a:off x="0" y="0"/>
+                      <a:ext cx="5943600" cy="4010660"/>
+                    </a:xfrm>
+                    <a:prstGeom prst="rect">
+                      <a:avLst/>
+                    </a:prstGeom>
+                    <a:noFill/>
+                    <a:ln>
+                      <a:noFill/>
+                    </a:ln>
+                  </pic:spPr>
+                </pic:pic>
+              </a:graphicData>
+            </a:graphic>
+          </wp:inline>
+        </w:drawing>
+      </w:r>
+    </w:p>
+    <w:p>
+      <w:pPr>
+        <w:pStyle w:val="Caption"/>
+      </w:pPr>
+      <w:r>
+        <w:rPr>
+          <w:b/>
+          <w:bCs/>
+          <w:szCs w:val="20"/>
+        </w:rPr>
+        <w:t xml:space="preserve">Figure </w:t>
+      </w:r>
+      <w:r>
+        <w:rPr>
+          <w:b/>
+          <w:bCs/>
+          <w:szCs w:val="20"/>
+        </w:rPr>
+        <w:fldChar w:fldCharType="begin"/>
+      </w:r>
+      <w:r>
+        <w:rPr>
+          <w:b/>
+          <w:bCs/>
+          <w:szCs w:val="20"/>
+        </w:rPr>
+        <w:instrText xml:space="preserve"> SEQ Figure \* ARABIC </w:instrText>
+      </w:r>
+      <w:r>
+        <w:rPr>
+          <w:b/>
+          <w:bCs/>
+          <w:szCs w:val="20"/>
+        </w:rPr>
+        <w:fldChar w:fldCharType="separate"/>
+      </w:r>
+      <w:r>
+        <w:rPr>
+          <w:b/>
+          <w:bCs/>
+          <w:noProof/>
+          <w:szCs w:val="20"/>
+        </w:rPr>
+        <w:t>4</w:t>
+      </w:r>
+      <w:r>
+        <w:rPr>
+          <w:b/>
+          <w:bCs/>
+          <w:szCs w:val="20"/>
+        </w:rPr>
+        <w:fldChar w:fldCharType="end"/>
+      </w:r>
+      <w:r>
+        <w:rPr>
+          <w:b/>
+          <w:bCs/>
+          <w:szCs w:val="20"/>
+        </w:rPr>
+        <w:t xml:space="preserve"> </w:t>
+      </w:r>
+      <w:r>
+        <w:rPr>
+          <w:b/>
+          <w:bCs/>
+          <w:szCs w:val="20"/>
+        </w:rPr>
+        <w:t>–</w:t>
+      </w:r>
+      <w:r>
+        <w:rPr>
+          <w:b/>
+          <w:bCs/>
+          <w:szCs w:val="20"/>
+        </w:rPr>
+        <w:t xml:space="preserve"> </w:t>
+      </w:r>
+      <w:r>
+        <w:rPr>
+          <w:b/>
+          <w:bCs/>
+        </w:rPr>
+        <w:t>Simple Systems Engineering graph</w:t>
+      </w:r>
+      <w:r>
+        <w:rPr>
+          <w:b/>
+          <w:bCs/>
+        </w:rPr>
+        <w:t>.</w:t>
+      </w:r>
+    </w:p>
+    <w:p>
+      <w:r>
+        <w:t xml:space="preserve">The following plot </w:t>
+      </w:r>
+      <w:r>
+        <w:t>provides a simplified visualization for the actual size graph where elements are clustered by domain and tier.</w:t>
+      </w:r>
+    </w:p>
+    <w:p>
+      <w:r>
+        <w:rPr>
+          <w:noProof/>
+        </w:rPr>
+        <w:lastRenderedPageBreak/>
+        <w:drawing>
+          <wp:inline distT="0" distB="0" distL="0" distR="0" wp14:anchorId="1E1C4CB5" wp14:editId="798536C3">
+            <wp:extent cx="5833872" cy="6976872"/>
+            <wp:effectExtent l="0" t="0" r="0" b="0"/>
+            <wp:docPr id="1905903506" name="Picture 3"/>
+            <wp:cNvGraphicFramePr>
+              <a:graphicFrameLocks xmlns:a="http://schemas.openxmlformats.org/drawingml/2006/main" noChangeAspect="1"/>
+            </wp:cNvGraphicFramePr>
+            <a:graphic xmlns:a="http://schemas.openxmlformats.org/drawingml/2006/main">
+              <a:graphicData uri="http://schemas.openxmlformats.org/drawingml/2006/picture">
+                <pic:pic xmlns:pic="http://schemas.openxmlformats.org/drawingml/2006/picture">
+                  <pic:nvPicPr>
+                    <pic:cNvPr id="0" name="Picture 5"/>
+                    <pic:cNvPicPr>
+                      <a:picLocks noChangeAspect="1" noChangeArrowheads="1"/>
+                    </pic:cNvPicPr>
+                  </pic:nvPicPr>
+                  <pic:blipFill>
+                    <a:blip r:embed="rId11">
+                      <a:extLst>
+                        <a:ext uri="{28A0092B-C50C-407E-A947-70E740481C1C}">
+                          <a14:useLocalDpi xmlns:a14="http://schemas.microsoft.com/office/drawing/2010/main" val="0"/>
+                        </a:ext>
+                      </a:extLst>
+                    </a:blip>
+                    <a:srcRect/>
+                    <a:stretch>
+                      <a:fillRect/>
+                    </a:stretch>
+                  </pic:blipFill>
+                  <pic:spPr bwMode="auto">
+                    <a:xfrm>
+                      <a:off x="0" y="0"/>
+                      <a:ext cx="5833872" cy="6976872"/>
+                    </a:xfrm>
+                    <a:prstGeom prst="rect">
+                      <a:avLst/>
+                    </a:prstGeom>
+                    <a:noFill/>
+                    <a:ln>
+                      <a:noFill/>
+                    </a:ln>
+                  </pic:spPr>
+                </pic:pic>
+              </a:graphicData>
+            </a:graphic>
+          </wp:inline>
+        </w:drawing>
+      </w:r>
+    </w:p>
+    <w:p>
+      <w:pPr>
+        <w:pStyle w:val="Caption"/>
+        <w:rPr>
+          <w:szCs w:val="20"/>
+        </w:rPr>
+      </w:pPr>
+      <w:r>
+        <w:rPr>
+          <w:b/>
+          <w:bCs/>
+          <w:szCs w:val="20"/>
+        </w:rPr>
+        <w:t xml:space="preserve">Figure </w:t>
+      </w:r>
+      <w:r>
+        <w:rPr>
+          <w:b/>
+          <w:bCs/>
+          <w:szCs w:val="20"/>
+        </w:rPr>
+        <w:fldChar w:fldCharType="begin"/>
+      </w:r>
+      <w:r>
+        <w:rPr>
+          <w:b/>
+          <w:bCs/>
+          <w:szCs w:val="20"/>
+        </w:rPr>
+        <w:instrText xml:space="preserve"> SEQ Figure \* ARABIC </w:instrText>
+      </w:r>
+      <w:r>
+        <w:rPr>
+          <w:b/>
+          <w:bCs/>
+          <w:szCs w:val="20"/>
+        </w:rPr>
+        <w:fldChar w:fldCharType="separate"/>
+      </w:r>
+      <w:r>
+        <w:rPr>
+          <w:b/>
+          <w:bCs/>
+          <w:noProof/>
+          <w:szCs w:val="20"/>
+        </w:rPr>
+        <w:t>5</w:t>
+      </w:r>
+      <w:r>
+        <w:rPr>
+          <w:b/>
+          <w:bCs/>
+          <w:szCs w:val="20"/>
+        </w:rPr>
+        <w:fldChar w:fldCharType="end"/>
+      </w:r>
+      <w:r>
+        <w:rPr>
+          <w:b/>
+          <w:bCs/>
+          <w:szCs w:val="20"/>
+        </w:rPr>
+        <w:t xml:space="preserve"> - Outlier density in a System Requirements </w:t>
+      </w:r>
+      <w:r>
+        <w:rPr>
+          <w:b/>
+          <w:bCs/>
+          <w:szCs w:val="20"/>
+        </w:rPr>
+        <w:t>T</w:t>
+      </w:r>
+      <w:r>
+        <w:rPr>
+          <w:b/>
+          <w:bCs/>
+          <w:szCs w:val="20"/>
+        </w:rPr>
+        <w:t xml:space="preserve">raceability </w:t>
+      </w:r>
+      <w:r>
+        <w:rPr>
+          <w:b/>
+          <w:bCs/>
+          <w:szCs w:val="20"/>
+        </w:rPr>
+        <w:t>N</w:t>
+      </w:r>
+      <w:r>
+        <w:rPr>
+          <w:b/>
+          <w:bCs/>
+          <w:szCs w:val="20"/>
+        </w:rPr>
+        <w:t xml:space="preserve">etwork. </w:t>
+      </w:r>
+      <w:r>
+        <w:rPr>
+          <w:szCs w:val="20"/>
+        </w:rPr>
+        <w:t>Requirements are allocated to functions and components then satisfied by child elements in each hierarchy. Type 1 outliers are allocations that are not satisfied. Type 2 outliers are satisfy links to requirements that are not allocated to a parent element.</w:t>
+      </w:r>
+    </w:p>
+    <w:p>
+      <w:r>
+        <w:lastRenderedPageBreak/>
         <w:t>Our project will explore the impact of the presence of those outliers on the performance of different GNN architectures and also compare their performance to non-GNN based classifier NN methods.</w:t>
       </w:r>
     </w:p>
+    <w:p/>
     <w:p>
       <w:r>
         <w:br w:type="page"/>
@@ -228,21 +964,19 @@
     </w:p>
     <w:sdt>
       <w:sdtPr>
+        <w:rPr>
+          <w:rFonts w:asciiTheme="minorHAnsi" w:eastAsiaTheme="minorHAnsi" w:hAnsiTheme="minorHAnsi" w:cstheme="minorBidi"/>
+          <w:b w:val="0"/>
+          <w:color w:val="auto"/>
+          <w:sz w:val="24"/>
+          <w:szCs w:val="24"/>
+        </w:rPr>
         <w:id w:val="1637297499"/>
         <w:docPartObj>
           <w:docPartGallery w:val="Bibliographies"/>
           <w:docPartUnique/>
         </w:docPartObj>
       </w:sdtPr>
-      <w:sdtEndPr>
-        <w:rPr>
-          <w:rFonts w:asciiTheme="minorHAnsi" w:eastAsiaTheme="minorHAnsi" w:hAnsiTheme="minorHAnsi" w:cstheme="minorBidi"/>
-          <w:b w:val="0"/>
-          <w:color w:val="auto"/>
-          <w:sz w:val="24"/>
-          <w:szCs w:val="24"/>
-        </w:rPr>
-      </w:sdtEndPr>
       <w:sdtContent>
         <w:p>
           <w:pPr>
@@ -335,7 +1069,7 @@
       <w:lvlText w:val="-"/>
       <w:lvlJc w:val="left"/>
       <w:pPr>
-        <w:ind w:left="720" w:hanging="360"/>
+        <w:ind w:left="360" w:hanging="360"/>
       </w:pPr>
       <w:rPr>
         <w:rFonts w:ascii="Calibri" w:eastAsiaTheme="minorHAnsi" w:hAnsi="Calibri" w:cs="Calibri" w:hint="default"/>
@@ -347,7 +1081,7 @@
       <w:lvlText w:val="o"/>
       <w:lvlJc w:val="left"/>
       <w:pPr>
-        <w:ind w:left="1440" w:hanging="360"/>
+        <w:ind w:left="1080" w:hanging="360"/>
       </w:pPr>
       <w:rPr>
         <w:rFonts w:ascii="Courier New" w:hAnsi="Courier New" w:cs="Courier New" w:hint="default"/>
@@ -359,7 +1093,7 @@
       <w:lvlText w:val=""/>
       <w:lvlJc w:val="left"/>
       <w:pPr>
-        <w:ind w:left="2160" w:hanging="360"/>
+        <w:ind w:left="1800" w:hanging="360"/>
       </w:pPr>
       <w:rPr>
         <w:rFonts w:ascii="Wingdings" w:hAnsi="Wingdings" w:hint="default"/>
@@ -371,7 +1105,7 @@
       <w:lvlText w:val=""/>
       <w:lvlJc w:val="left"/>
       <w:pPr>
-        <w:ind w:left="2880" w:hanging="360"/>
+        <w:ind w:left="2520" w:hanging="360"/>
       </w:pPr>
       <w:rPr>
         <w:rFonts w:ascii="Symbol" w:hAnsi="Symbol" w:hint="default"/>
@@ -383,7 +1117,7 @@
       <w:lvlText w:val="o"/>
       <w:lvlJc w:val="left"/>
       <w:pPr>
-        <w:ind w:left="3600" w:hanging="360"/>
+        <w:ind w:left="3240" w:hanging="360"/>
       </w:pPr>
       <w:rPr>
         <w:rFonts w:ascii="Courier New" w:hAnsi="Courier New" w:cs="Courier New" w:hint="default"/>
@@ -395,7 +1129,7 @@
       <w:lvlText w:val=""/>
       <w:lvlJc w:val="left"/>
       <w:pPr>
-        <w:ind w:left="4320" w:hanging="360"/>
+        <w:ind w:left="3960" w:hanging="360"/>
       </w:pPr>
       <w:rPr>
         <w:rFonts w:ascii="Wingdings" w:hAnsi="Wingdings" w:hint="default"/>
@@ -407,7 +1141,7 @@
       <w:lvlText w:val=""/>
       <w:lvlJc w:val="left"/>
       <w:pPr>
-        <w:ind w:left="5040" w:hanging="360"/>
+        <w:ind w:left="4680" w:hanging="360"/>
       </w:pPr>
       <w:rPr>
         <w:rFonts w:ascii="Symbol" w:hAnsi="Symbol" w:hint="default"/>
@@ -419,7 +1153,7 @@
       <w:lvlText w:val="o"/>
       <w:lvlJc w:val="left"/>
       <w:pPr>
-        <w:ind w:left="5760" w:hanging="360"/>
+        <w:ind w:left="5400" w:hanging="360"/>
       </w:pPr>
       <w:rPr>
         <w:rFonts w:ascii="Courier New" w:hAnsi="Courier New" w:cs="Courier New" w:hint="default"/>
@@ -431,7 +1165,7 @@
       <w:lvlText w:val=""/>
       <w:lvlJc w:val="left"/>
       <w:pPr>
-        <w:ind w:left="6480" w:hanging="360"/>
+        <w:ind w:left="6120" w:hanging="360"/>
       </w:pPr>
       <w:rPr>
         <w:rFonts w:ascii="Wingdings" w:hAnsi="Wingdings" w:hint="default"/>
@@ -1372,6 +2106,25 @@
     <w:unhideWhenUsed/>
     <w:rsid w:val="00345A4D"/>
   </w:style>
+  <w:style w:type="paragraph" w:styleId="Caption">
+    <w:name w:val="caption"/>
+    <w:basedOn w:val="Normal"/>
+    <w:next w:val="Normal"/>
+    <w:uiPriority w:val="35"/>
+    <w:unhideWhenUsed/>
+    <w:qFormat/>
+    <w:rsid w:val="00C440BF"/>
+    <w:pPr>
+      <w:spacing w:after="200" w:line="240" w:lineRule="auto"/>
+      <w:jc w:val="center"/>
+    </w:pPr>
+    <w:rPr>
+      <w:iCs/>
+      <w:color w:val="000000" w:themeColor="text1"/>
+      <w:sz w:val="20"/>
+      <w:szCs w:val="18"/>
+    </w:rPr>
+  </w:style>
 </w:styles>
 </file>
 

</xml_diff>